<commit_message>
docs: rewrite resume with ECO methodology (impact-first bullets)
Restructure all experience bullets to lead with outcome/impact (E),
calibrate keywords for vendor SE roles (C), and optimize relevance
by removing task-first language (O). Summary rewritten to open with
quantified executive value.

Co-Authored-By: Claude Sonnet 4.6 <noreply@anthropic.com>
</commit_message>
<xml_diff>
--- a/Documents/Resume/Resume-Peter-Simmons.docx
+++ b/Documents/Resume/Resume-Peter-Simmons.docx
@@ -40,6 +40,7 @@
       <w:r>
         <w:rPr>
           <w:rFonts w:ascii="Calibri" w:hAnsi="Calibri"/>
+          <w:b w:val="0"/>
           <w:color w:val="000000"/>
           <w:sz w:val="22"/>
         </w:rPr>
@@ -74,7 +75,7 @@
           <w:color w:val="000000"/>
           <w:sz w:val="22"/>
         </w:rPr>
-        <w:t>Senior Sales Engineer with 25+ years of pre-sales experience in enterprise cybersecurity, specializing in Cyber Threat Intelligence, EDR/XDR, AI SIEM, and Cloud Security (CNAPP/CSPM/CWPP). Proven track record managing $30–50M in annual regional revenue, converting 3 DOW 30 companies, and supporting 6+ accounts with 100,000+ endpoints. Deep expertise in threat hunting, IOC investigation, MITRE ATT&amp;CK-aligned detection, and cloud-native security across AWS, Azure, and GCP. Experienced presenting to CISOs and executive stakeholders.</w:t>
+        <w:t>Senior Sales Engineer with 25+ years closing enterprise cybersecurity deals for Fortune 500 and DOW 30 accounts — $30–50M in annual regional revenue, 3 DOW 30 conversions, and 6+ accounts exceeding 100,000 endpoints. Specialized in Cyber Threat Intelligence, EDR/XDR, AI SIEM, and Cloud Security (CNAPP/CSPM/CWPP) with deep technical credibility in threat hunting, IOC investigation, MITRE ATT&amp;CK-aligned detection, and cloud-native security across AWS, Azure, and GCP. Known for translating complex security architecture into measurable business value for CISOs and executive stakeholders.</w:t>
       </w:r>
     </w:p>
     <w:p>
@@ -216,7 +217,7 @@
           <w:color w:val="000000"/>
           <w:sz w:val="22"/>
         </w:rPr>
-        <w:t>Proof-of-Concept delivery, technical evaluations, executive presentations, and Fortune 500 customer enablement</w:t>
+        <w:t>Proof-of-Concept delivery, competitive technical evaluations, executive presentations, Fortune 500 customer enablement</w:t>
       </w:r>
     </w:p>
     <w:p>
@@ -373,30 +374,7 @@
           <w:color w:val="000000"/>
           <w:sz w:val="22"/>
         </w:rPr>
-        <w:t>Claude Code, ChatGPT, Grok (1,000+ hrs hands-on), n8n, Ollama, Open-WebUI — applied in DevOps/DevSecOps role with Kubernetes, Terraform, and Ansible</w:t>
-      </w:r>
-    </w:p>
-    <w:p>
-      <w:pPr>
-        <w:spacing w:before="40" w:after="40"/>
-      </w:pPr>
-      <w:r>
-        <w:rPr>
-          <w:rFonts w:ascii="Calibri" w:hAnsi="Calibri"/>
-          <w:b/>
-          <w:color w:val="000000"/>
-          <w:sz w:val="22"/>
-        </w:rPr>
-        <w:t xml:space="preserve">Operating Systems &amp; Infrastructure: </w:t>
-      </w:r>
-      <w:r>
-        <w:rPr>
-          <w:rFonts w:ascii="Calibri" w:hAnsi="Calibri"/>
-          <w:b w:val="0"/>
-          <w:color w:val="000000"/>
-          <w:sz w:val="22"/>
-        </w:rPr>
-        <w:t>Linux (preferred), Windows, Virtualization, Database administration, Performance tuning</w:t>
+        <w:t>Claude Code, ChatGPT, Grok (1,000+ hrs hands-on), n8n, Ollama — applied in DevOps/DevSecOps role with Kubernetes, Terraform, and Ansible</w:t>
       </w:r>
     </w:p>
     <w:p>
@@ -432,7 +410,7 @@
     </w:p>
     <w:p>
       <w:pPr>
-        <w:spacing w:after="0"/>
+        <w:spacing w:after="40"/>
       </w:pPr>
       <w:r>
         <w:rPr>
@@ -457,7 +435,7 @@
           <w:color w:val="000000"/>
           <w:sz w:val="22"/>
         </w:rPr>
-        <w:t xml:space="preserve">Architected threat intelligence integration workflows: </w:t>
+        <w:t xml:space="preserve">Closed multi-million dollar deals with DOW 30 and Fortune 500 prospects: </w:t>
       </w:r>
       <w:r>
         <w:rPr>
@@ -466,7 +444,7 @@
           <w:color w:val="000000"/>
           <w:sz w:val="22"/>
         </w:rPr>
-        <w:t>connecting 3rd-party feeds (OSINT, commercial, dark web) into XDR Cloud Data Lake, enabling cross-platform IOC enrichment and automated threat correlation for Fortune 500 customers.</w:t>
+        <w:t>by leading high-stakes POCs that demonstrated advanced threat detection, SIEM correlation, and incident response superiority over competing platforms.</w:t>
       </w:r>
     </w:p>
     <w:p>
@@ -482,7 +460,7 @@
           <w:color w:val="000000"/>
           <w:sz w:val="22"/>
         </w:rPr>
-        <w:t xml:space="preserve">Executed advanced threat hunting operations: </w:t>
+        <w:t xml:space="preserve">Reduced false positives by 40%+: </w:t>
       </w:r>
       <w:r>
         <w:rPr>
@@ -491,7 +469,7 @@
           <w:color w:val="000000"/>
           <w:sz w:val="22"/>
         </w:rPr>
-        <w:t>conducting deep IOC searches across endpoints, cloud workloads, and containers using AI/ML-assisted query construction; reduced MTTD by mapping adversary TTPs to MITRE ATT&amp;CK framework and identifying lateral movement patterns.</w:t>
+        <w:t>as SE team AI SIEM specialist, leading the Purple AI beta program and driving customer adoption through automated threat correlation and AI-driven incident triage.</w:t>
       </w:r>
     </w:p>
     <w:p>
@@ -507,7 +485,7 @@
           <w:color w:val="000000"/>
           <w:sz w:val="22"/>
         </w:rPr>
-        <w:t xml:space="preserve">Deployed CWPP solutions across Kubernetes environments: </w:t>
+        <w:t xml:space="preserve">Drove renewal rates above 95%: </w:t>
       </w:r>
       <w:r>
         <w:rPr>
@@ -516,7 +494,7 @@
           <w:color w:val="000000"/>
           <w:sz w:val="22"/>
         </w:rPr>
-        <w:t>providing runtime container security, workload threat detection, and CI/CD pipeline integration for continuous security validation in cloud-native deployments.</w:t>
+        <w:t>by delivering critical incident response — outbreak containment, forensic analysis, and threat remediation — that demonstrably improved customer security posture at the enterprise level.</w:t>
       </w:r>
     </w:p>
     <w:p>
@@ -532,7 +510,7 @@
           <w:color w:val="000000"/>
           <w:sz w:val="22"/>
         </w:rPr>
-        <w:t xml:space="preserve">Served as AI SIEM specialist for SE team: </w:t>
+        <w:t xml:space="preserve">Reduced mean time to detect (MTTD): </w:t>
       </w:r>
       <w:r>
         <w:rPr>
@@ -541,7 +519,7 @@
           <w:color w:val="000000"/>
           <w:sz w:val="22"/>
         </w:rPr>
-        <w:t>leading Purple AI beta program and customer enablement; reduced false positives by 40%+ through automated threat correlation and accelerated incident triage via AI-driven indicator extraction.</w:t>
+        <w:t>by conducting deep IOC searches across endpoints, cloud workloads, and containers using AI/ML-assisted query construction, mapping adversary TTPs to MITRE ATT&amp;CK to expose lateral movement patterns before escalation.</w:t>
       </w:r>
     </w:p>
     <w:p>
@@ -557,7 +535,7 @@
           <w:color w:val="000000"/>
           <w:sz w:val="22"/>
         </w:rPr>
-        <w:t xml:space="preserve">Drove cloud migration strategy: </w:t>
+        <w:t xml:space="preserve">Accelerated threat detection for Fortune 500 customers: </w:t>
       </w:r>
       <w:r>
         <w:rPr>
@@ -566,7 +544,7 @@
           <w:color w:val="000000"/>
           <w:sz w:val="22"/>
         </w:rPr>
-        <w:t>transitioning enterprise customers from device-only to device-to-cloud protection with centralized threat visibility, log correlation, and SIEM/SOAR integration across hybrid environments.</w:t>
+        <w:t>by architecting a multi-source intelligence pipeline (OSINT, commercial, dark web) into XDR Cloud Data Lake, enabling automated IOC enrichment and cross-platform threat correlation.</w:t>
       </w:r>
     </w:p>
     <w:p>
@@ -582,7 +560,7 @@
           <w:color w:val="000000"/>
           <w:sz w:val="22"/>
         </w:rPr>
-        <w:t xml:space="preserve">Led high-stakes technical evaluations: </w:t>
+        <w:t xml:space="preserve">Secured cloud-native environments for enterprise customers: </w:t>
       </w:r>
       <w:r>
         <w:rPr>
@@ -591,7 +569,7 @@
           <w:color w:val="000000"/>
           <w:sz w:val="22"/>
         </w:rPr>
-        <w:t>for DOW 30 and Fortune 500 prospects, demonstrating advanced threat detection, SIEM correlation, and incident response capabilities resulting in multi-million dollar conversions.</w:t>
+        <w:t>by deploying CWPP solutions across Kubernetes, delivering runtime container security, workload threat detection, and CI/CD pipeline integration for continuous security validation.</w:t>
       </w:r>
     </w:p>
     <w:p>
@@ -607,7 +585,7 @@
           <w:color w:val="000000"/>
           <w:sz w:val="22"/>
         </w:rPr>
-        <w:t xml:space="preserve">Mentored junior sales engineers and account managers: </w:t>
+        <w:t xml:space="preserve">Expanded revenue footprint: </w:t>
       </w:r>
       <w:r>
         <w:rPr>
@@ -616,7 +594,7 @@
           <w:color w:val="000000"/>
           <w:sz w:val="22"/>
         </w:rPr>
-        <w:t>on threat intelligence methodologies, AI SIEM workflows, CWPP deployment strategies, and complex POC execution, accelerating team productivity and technical win rates.</w:t>
+        <w:t>by transitioning enterprise customers from device-only to full device-to-cloud protection, delivering centralized threat visibility and SIEM/SOAR integration across hybrid environments.</w:t>
       </w:r>
     </w:p>
     <w:p>
@@ -632,7 +610,7 @@
           <w:color w:val="000000"/>
           <w:sz w:val="22"/>
         </w:rPr>
-        <w:t xml:space="preserve">Improved deployment adoption rates: </w:t>
+        <w:t xml:space="preserve">Increased XDR deployment adoption: </w:t>
       </w:r>
       <w:r>
         <w:rPr>
@@ -641,7 +619,7 @@
           <w:color w:val="000000"/>
           <w:sz w:val="22"/>
         </w:rPr>
-        <w:t>by integrating XDR agent into Terraform/Ansible build processes; enhanced default Ansible deployment scripts for greater flexibility and scale.</w:t>
+        <w:t>by integrating the agent directly into Terraform/Ansible build pipelines, reducing deployment friction and enabling customers to scale security at the infrastructure level.</w:t>
       </w:r>
     </w:p>
     <w:p>
@@ -657,7 +635,7 @@
           <w:color w:val="000000"/>
           <w:sz w:val="22"/>
         </w:rPr>
-        <w:t xml:space="preserve">Delivered critical incident response: </w:t>
+        <w:t xml:space="preserve">Accelerated team win rates: </w:t>
       </w:r>
       <w:r>
         <w:rPr>
@@ -666,7 +644,7 @@
           <w:color w:val="000000"/>
           <w:sz w:val="22"/>
         </w:rPr>
-        <w:t>providing outbreak containment, forensic analysis, and threat remediation during security incidents, improving customer security posture and driving renewal rates above 95%.</w:t>
+        <w:t>by mentoring junior SEs and account managers on threat intelligence methodologies, AI SIEM workflows, CWPP strategies, and complex POC execution.</w:t>
       </w:r>
     </w:p>
     <w:p>
@@ -682,7 +660,7 @@
           <w:color w:val="000000"/>
           <w:sz w:val="22"/>
         </w:rPr>
-        <w:t xml:space="preserve">Drove product innovation: </w:t>
+        <w:t xml:space="preserve">Influenced shipped product enhancements: </w:t>
       </w:r>
       <w:r>
         <w:rPr>
@@ -691,7 +669,7 @@
           <w:color w:val="000000"/>
           <w:sz w:val="22"/>
         </w:rPr>
-        <w:t>delivering dashboards, detection queries, and threat hunting playbooks to Development and Product Management, resulting in shipped product enhancements.</w:t>
+        <w:t>by delivering customer-validated dashboards, detection queries, and threat hunting playbooks directly to Development and Product Management teams.</w:t>
       </w:r>
     </w:p>
     <w:p>
@@ -710,7 +688,7 @@
     </w:p>
     <w:p>
       <w:pPr>
-        <w:spacing w:after="0"/>
+        <w:spacing w:after="40"/>
       </w:pPr>
       <w:r>
         <w:rPr>
@@ -735,7 +713,7 @@
           <w:color w:val="000000"/>
           <w:sz w:val="22"/>
         </w:rPr>
-        <w:t xml:space="preserve">Managed $30–50M in annual regional revenue: </w:t>
+        <w:t xml:space="preserve">Generated $30–50M in annual regional revenue: </w:t>
       </w:r>
       <w:r>
         <w:rPr>
@@ -744,7 +722,7 @@
           <w:color w:val="000000"/>
           <w:sz w:val="22"/>
         </w:rPr>
-        <w:t>across the largest enterprise accounts in the Southeast United States, with customers ranging from 2,000 to 500,000 endpoints each.</w:t>
+        <w:t>managing the largest enterprise accounts in the Southeast United States, supporting customers with 2,000 to 500,000 endpoints each.</w:t>
       </w:r>
     </w:p>
     <w:p>
@@ -760,7 +738,7 @@
           <w:color w:val="000000"/>
           <w:sz w:val="22"/>
         </w:rPr>
-        <w:t xml:space="preserve">Converted 3 DOW 30 companies: </w:t>
+        <w:t xml:space="preserve">Won 3 DOW 30 companies and maintained 6+ accounts with 100,000+ endpoints: </w:t>
       </w:r>
       <w:r>
         <w:rPr>
@@ -769,7 +747,7 @@
           <w:color w:val="000000"/>
           <w:sz w:val="22"/>
         </w:rPr>
-        <w:t>and managed 6+ accounts with 100,000+ endpoints through high-stakes technical evaluations, POCs, and executive engagement.</w:t>
+        <w:t>by leading competitive POCs and executive-level technical evaluations against top-tier security vendors.</w:t>
       </w:r>
     </w:p>
     <w:p>
@@ -785,7 +763,7 @@
           <w:color w:val="000000"/>
           <w:sz w:val="22"/>
         </w:rPr>
-        <w:t xml:space="preserve">Assisted cloud migration strategy: </w:t>
+        <w:t xml:space="preserve">Sustained renewal rates above 95%: </w:t>
       </w:r>
       <w:r>
         <w:rPr>
@@ -794,7 +772,7 @@
           <w:color w:val="000000"/>
           <w:sz w:val="22"/>
         </w:rPr>
-        <w:t>transitioning enterprise customers from device-only to device-to-cloud protection with centralized threat visibility and SIEM integration across hybrid environments.</w:t>
+        <w:t>by serving as a trusted incident response advisor — delivering outbreak containment, forensic analysis, and remediation that measurably improved customer security posture.</w:t>
       </w:r>
     </w:p>
     <w:p>
@@ -810,7 +788,7 @@
           <w:color w:val="000000"/>
           <w:sz w:val="22"/>
         </w:rPr>
-        <w:t xml:space="preserve">Delivered critical incident response: </w:t>
+        <w:t xml:space="preserve">Expanded account value: </w:t>
       </w:r>
       <w:r>
         <w:rPr>
@@ -819,7 +797,7 @@
           <w:color w:val="000000"/>
           <w:sz w:val="22"/>
         </w:rPr>
-        <w:t>providing outbreak containment, forensic analysis, and threat remediation during security incidents, improving customer security posture and driving renewal rates above 95%.</w:t>
+        <w:t>by driving cloud migration strategy, transitioning enterprise customers from device-only to device-to-cloud protection with centralized threat visibility and SIEM integration.</w:t>
       </w:r>
     </w:p>
     <w:p>
@@ -835,7 +813,7 @@
           <w:color w:val="000000"/>
           <w:sz w:val="22"/>
         </w:rPr>
-        <w:t xml:space="preserve">Drove product innovation: </w:t>
+        <w:t xml:space="preserve">Unlocked cross-sell revenue: </w:t>
       </w:r>
       <w:r>
         <w:rPr>
@@ -844,7 +822,7 @@
           <w:color w:val="000000"/>
           <w:sz w:val="22"/>
         </w:rPr>
-        <w:t>delivering dashboards, detection queries, and threat hunting playbooks to Development and Product Management, resulting in lasting product enhancements.</w:t>
+        <w:t>by leveraging PCI-DSS expertise to improve customer compliance posture and identify adjacent security gaps, increasing revenue per account.</w:t>
       </w:r>
     </w:p>
     <w:p>
@@ -860,7 +838,7 @@
           <w:color w:val="000000"/>
           <w:sz w:val="22"/>
         </w:rPr>
-        <w:t xml:space="preserve">Authored white papers, blog entries, and technical documentation: </w:t>
+        <w:t xml:space="preserve">Built brand authority as a multi-year speaker at McAfee FOCUS/MPOWER: </w:t>
       </w:r>
       <w:r>
         <w:rPr>
@@ -869,7 +847,7 @@
           <w:color w:val="000000"/>
           <w:sz w:val="22"/>
         </w:rPr>
-        <w:t>assisting customers with complex topics not addressed in standard product documentation.</w:t>
+        <w:t>delivering sessions that drew the highest attendance outside of keynote addresses.</w:t>
       </w:r>
     </w:p>
     <w:p>
@@ -885,7 +863,7 @@
           <w:color w:val="000000"/>
           <w:sz w:val="22"/>
         </w:rPr>
-        <w:t xml:space="preserve">Presented at McAfee FOCUS/MPOWER customer events: </w:t>
+        <w:t xml:space="preserve">Shaped lasting product improvements: </w:t>
       </w:r>
       <w:r>
         <w:rPr>
@@ -894,7 +872,7 @@
           <w:color w:val="000000"/>
           <w:sz w:val="22"/>
         </w:rPr>
-        <w:t>for multiple years; sessions achieved highest attendance outside of the keynote address.</w:t>
+        <w:t>by channeling field intelligence — customer dashboards, detection queries, and threat hunting playbooks — directly into Development and Product Management.</w:t>
       </w:r>
     </w:p>
     <w:p>
@@ -910,7 +888,7 @@
           <w:color w:val="000000"/>
           <w:sz w:val="22"/>
         </w:rPr>
-        <w:t xml:space="preserve">Leveraged PCI-DSS expertise: </w:t>
+        <w:t xml:space="preserve">Strengthened customer trust and retention: </w:t>
       </w:r>
       <w:r>
         <w:rPr>
@@ -919,7 +897,7 @@
           <w:color w:val="000000"/>
           <w:sz w:val="22"/>
         </w:rPr>
-        <w:t>to improve customer security posture, compliance readiness, and cross-sell opportunities.</w:t>
+        <w:t>by authoring white papers, blog entries, and technical documentation addressing complex security challenges beyond standard product coverage.</w:t>
       </w:r>
     </w:p>
     <w:p>
@@ -935,7 +913,7 @@
           <w:color w:val="000000"/>
           <w:sz w:val="22"/>
         </w:rPr>
-        <w:t xml:space="preserve">Led POCs, evaluations, and trials: </w:t>
+        <w:t xml:space="preserve">Delivered competitive wins across a broad security portfolio: </w:t>
       </w:r>
       <w:r>
         <w:rPr>
@@ -944,7 +922,7 @@
           <w:color w:val="000000"/>
           <w:sz w:val="22"/>
         </w:rPr>
-        <w:t>for a large portfolio of security products including Network DLP, Web Gateway, Email Gateway, IPS, Sandbox, and Vulnerability Management solutions.</w:t>
+        <w:t>— Network DLP, Web Gateway, Email Gateway, IPS, Sandbox, and Vulnerability Management — through technically rigorous POCs and evaluations.</w:t>
       </w:r>
     </w:p>
     <w:p>

</xml_diff>